<commit_message>
modified:   docs/Eurorack/304-Quad-Channel-Voltage-Controlled-Mixer/Files/manual.docx 	renamed:    docs/Eurorack/310c-Diode-Voltage-Controlled-Filter/Files/~$0c-Rev.1.docx -> docs/Eurorack/304-Quad-Channel-Voltage-Controlled-Mixer/Files/~$manual.docx 	modified:   docs/Eurorack/304-Quad-Channel-Voltage-Controlled-Mixer/Manual.md
Changes not staged for commit:
	deleted:    docs/Eurorack/304-Quad-Channel-Voltage-Controlled-Mixer/Files/manual.docx
	deleted:    docs/Eurorack/304-Quad-Channel-Voltage-Controlled-Mixer/Files/~$manual.docx
	modified:   docs/Eurorack/310c-Diode-Voltage-Controlled-Filter/Manual.md

Untracked files:
	docs/Eurorack/304-Quad-Channel-Voltage-Controlled-Mixer/Files/304-Rev.1.docx
	docs/Eurorack/304-Quad-Channel-Voltage-Controlled-Mixer/Files/~$4-Rev.1.docx
	docs/Eurorack/304-Quad-Channel-Voltage-Controlled-Mixer/Images/304-block.png
</commit_message>
<xml_diff>
--- a/docs/Eurorack/304-Quad-Channel-Voltage-Controlled-Mixer/Files/manual.docx
+++ b/docs/Eurorack/304-Quad-Channel-Voltage-Controlled-Mixer/Files/manual.docx
@@ -22,40 +22,9 @@
           <w:u w:val="single"/>
           <w:lang w:val="en-US"/>
         </w:rPr>
-        <w:t>XXX Module Name User Manual</w:t>
-      </w:r>
-    </w:p>
-    <w:p>
-      <w:pPr>
-        <w:spacing w:line="360" w:lineRule="auto"/>
-        <w:jc w:val="center"/>
-        <w:rPr>
-          <w:rFonts w:ascii="Times New Roman" w:hAnsi="Times New Roman" w:cs="Times New Roman"/>
-          <w:u w:val="single"/>
-          <w:lang w:val="en-US"/>
-        </w:rPr>
-      </w:pPr>
-      <w:r>
-        <w:rPr>
-          <w:rFonts w:ascii="Times New Roman" w:hAnsi="Times New Roman" w:cs="Times New Roman"/>
-          <w:u w:val="single"/>
-          <w:lang w:val="en-US"/>
-        </w:rPr>
-        <w:t>03-04-2020 Rev. 1</w:t>
-      </w:r>
-    </w:p>
-    <w:p>
-      <w:pPr>
-        <w:spacing w:line="360" w:lineRule="auto"/>
-        <w:rPr>
-          <w:rFonts w:ascii="Times New Roman" w:hAnsi="Times New Roman" w:cs="Times New Roman"/>
-          <w:lang w:val="en-US"/>
-        </w:rPr>
-      </w:pPr>
-    </w:p>
-    <w:p>
-      <w:pPr>
-        <w:spacing w:line="360" w:lineRule="auto"/>
+        <w:t>304 Quad Channel Voltage Controlled Mixer</w:t>
+      </w:r>
+      <w:r>
         <w:rPr>
           <w:rFonts w:ascii="Times New Roman" w:hAnsi="Times New Roman" w:cs="Times New Roman"/>
           <w:b/>
@@ -63,8 +32,80 @@
           <w:u w:val="single"/>
           <w:lang w:val="en-US"/>
         </w:rPr>
-      </w:pPr>
-      <w:r>
+        <w:t xml:space="preserve"> User Manual</w:t>
+      </w:r>
+    </w:p>
+    <w:p>
+      <w:pPr>
+        <w:spacing w:line="360" w:lineRule="auto"/>
+        <w:jc w:val="center"/>
+        <w:rPr>
+          <w:rFonts w:ascii="Times New Roman" w:hAnsi="Times New Roman" w:cs="Times New Roman"/>
+          <w:u w:val="single"/>
+          <w:lang w:val="en-US"/>
+        </w:rPr>
+      </w:pPr>
+      <w:r>
+        <w:rPr>
+          <w:rFonts w:ascii="Times New Roman" w:hAnsi="Times New Roman" w:cs="Times New Roman"/>
+          <w:u w:val="single"/>
+          <w:lang w:val="en-US"/>
+        </w:rPr>
+        <w:t>20</w:t>
+      </w:r>
+      <w:r>
+        <w:rPr>
+          <w:rFonts w:ascii="Times New Roman" w:hAnsi="Times New Roman" w:cs="Times New Roman"/>
+          <w:u w:val="single"/>
+          <w:lang w:val="en-US"/>
+        </w:rPr>
+        <w:t>-0</w:t>
+      </w:r>
+      <w:r>
+        <w:rPr>
+          <w:rFonts w:ascii="Times New Roman" w:hAnsi="Times New Roman" w:cs="Times New Roman"/>
+          <w:u w:val="single"/>
+          <w:lang w:val="en-US"/>
+        </w:rPr>
+        <w:t>5</w:t>
+      </w:r>
+      <w:r>
+        <w:rPr>
+          <w:rFonts w:ascii="Times New Roman" w:hAnsi="Times New Roman" w:cs="Times New Roman"/>
+          <w:u w:val="single"/>
+          <w:lang w:val="en-US"/>
+        </w:rPr>
+        <w:t>-202</w:t>
+      </w:r>
+      <w:r>
+        <w:rPr>
+          <w:rFonts w:ascii="Times New Roman" w:hAnsi="Times New Roman" w:cs="Times New Roman"/>
+          <w:u w:val="single"/>
+          <w:lang w:val="en-US"/>
+        </w:rPr>
+        <w:t>6</w:t>
+      </w:r>
+      <w:r>
+        <w:rPr>
+          <w:rFonts w:ascii="Times New Roman" w:hAnsi="Times New Roman" w:cs="Times New Roman"/>
+          <w:u w:val="single"/>
+          <w:lang w:val="en-US"/>
+        </w:rPr>
+        <w:t xml:space="preserve"> Rev. 1</w:t>
+      </w:r>
+    </w:p>
+    <w:p>
+      <w:pPr>
+        <w:spacing w:line="360" w:lineRule="auto"/>
+        <w:rPr>
+          <w:rFonts w:ascii="Times New Roman" w:hAnsi="Times New Roman" w:cs="Times New Roman"/>
+          <w:lang w:val="en-US"/>
+        </w:rPr>
+      </w:pPr>
+    </w:p>
+    <w:p>
+      <w:pPr>
+        <w:spacing w:line="360" w:lineRule="auto"/>
         <w:rPr>
           <w:rFonts w:ascii="Times New Roman" w:hAnsi="Times New Roman" w:cs="Times New Roman"/>
           <w:b/>
@@ -72,21 +113,8 @@
           <w:u w:val="single"/>
           <w:lang w:val="en-US"/>
         </w:rPr>
-        <w:t>1 Introduction</w:t>
-      </w:r>
-    </w:p>
-    <w:p>
-      <w:pPr>
-        <w:spacing w:line="360" w:lineRule="auto"/>
-        <w:rPr>
-          <w:rFonts w:ascii="Times New Roman" w:hAnsi="Times New Roman" w:cs="Times New Roman"/>
-          <w:lang w:val="en-US"/>
-        </w:rPr>
-      </w:pPr>
-    </w:p>
-    <w:p>
-      <w:pPr>
-        <w:spacing w:line="360" w:lineRule="auto"/>
+      </w:pPr>
+      <w:r>
         <w:rPr>
           <w:rFonts w:ascii="Times New Roman" w:hAnsi="Times New Roman" w:cs="Times New Roman"/>
           <w:b/>
@@ -94,52 +122,109 @@
           <w:u w:val="single"/>
           <w:lang w:val="en-US"/>
         </w:rPr>
-      </w:pPr>
-    </w:p>
-    <w:p>
-      <w:pPr>
-        <w:pStyle w:val="ListParagraph"/>
-        <w:numPr>
-          <w:ilvl w:val="1"/>
-          <w:numId w:val="1"/>
-        </w:numPr>
-        <w:spacing w:line="360" w:lineRule="auto"/>
-        <w:rPr>
-          <w:rFonts w:ascii="Times New Roman" w:hAnsi="Times New Roman" w:cs="Times New Roman"/>
-          <w:b/>
-          <w:bCs/>
-          <w:lang w:val="en-US"/>
-        </w:rPr>
-      </w:pPr>
-      <w:r>
-        <w:rPr>
-          <w:rFonts w:ascii="Times New Roman" w:hAnsi="Times New Roman" w:cs="Times New Roman"/>
-          <w:b/>
-          <w:bCs/>
-          <w:lang w:val="en-US"/>
-        </w:rPr>
-        <w:t>Features</w:t>
-      </w:r>
-    </w:p>
-    <w:p>
-      <w:pPr>
-        <w:spacing w:line="360" w:lineRule="auto"/>
-        <w:rPr>
-          <w:rFonts w:ascii="Times New Roman" w:hAnsi="Times New Roman" w:cs="Times New Roman"/>
-          <w:b/>
-          <w:bCs/>
-          <w:lang w:val="en-US"/>
-        </w:rPr>
-      </w:pPr>
-    </w:p>
-    <w:p>
-      <w:pPr>
-        <w:spacing w:line="360" w:lineRule="auto"/>
-        <w:rPr>
-          <w:rFonts w:ascii="Times New Roman" w:hAnsi="Times New Roman" w:cs="Times New Roman"/>
-          <w:lang w:val="en-US"/>
-        </w:rPr>
-      </w:pPr>
+        <w:t>1 Introduction</w:t>
+      </w:r>
+    </w:p>
+    <w:p>
+      <w:pPr>
+        <w:spacing w:line="360" w:lineRule="auto"/>
+        <w:rPr>
+          <w:rFonts w:ascii="Times New Roman" w:hAnsi="Times New Roman" w:cs="Times New Roman"/>
+          <w:lang w:val="en-US"/>
+        </w:rPr>
+      </w:pPr>
+      <w:r>
+        <w:rPr>
+          <w:rFonts w:ascii="Times New Roman" w:hAnsi="Times New Roman" w:cs="Times New Roman"/>
+          <w:lang w:val="en-US"/>
+        </w:rPr>
+        <w:t xml:space="preserve">The </w:t>
+      </w:r>
+      <w:r>
+        <w:rPr>
+          <w:rFonts w:ascii="Times New Roman" w:hAnsi="Times New Roman" w:cs="Times New Roman"/>
+          <w:i/>
+          <w:iCs/>
+          <w:lang w:val="en-US"/>
+        </w:rPr>
+        <w:t xml:space="preserve">304 </w:t>
+      </w:r>
+      <w:r>
+        <w:rPr>
+          <w:rFonts w:ascii="Times New Roman" w:hAnsi="Times New Roman" w:cs="Times New Roman"/>
+          <w:i/>
+          <w:iCs/>
+          <w:lang w:val="en-US"/>
+        </w:rPr>
+        <w:t>Quad Channel Voltage Controlled Mixer</w:t>
+      </w:r>
+      <w:r>
+        <w:rPr>
+          <w:rFonts w:ascii="Times New Roman" w:hAnsi="Times New Roman" w:cs="Times New Roman"/>
+          <w:lang w:val="en-US"/>
+        </w:rPr>
+        <w:t xml:space="preserve"> is </w:t>
+      </w:r>
+      <w:r>
+        <w:rPr>
+          <w:rFonts w:ascii="Times New Roman" w:hAnsi="Times New Roman" w:cs="Times New Roman"/>
+          <w:lang w:val="en-US"/>
+        </w:rPr>
+        <w:t xml:space="preserve">four </w:t>
+      </w:r>
+      <w:proofErr w:type="gramStart"/>
+      <w:r>
+        <w:rPr>
+          <w:rFonts w:ascii="Times New Roman" w:hAnsi="Times New Roman" w:cs="Times New Roman"/>
+          <w:lang w:val="en-US"/>
+        </w:rPr>
+        <w:t>individual</w:t>
+      </w:r>
+      <w:proofErr w:type="gramEnd"/>
+      <w:r>
+        <w:rPr>
+          <w:rFonts w:ascii="Times New Roman" w:hAnsi="Times New Roman" w:cs="Times New Roman"/>
+          <w:lang w:val="en-US"/>
+        </w:rPr>
+        <w:t xml:space="preserve"> </w:t>
+      </w:r>
+      <w:r>
+        <w:rPr>
+          <w:rFonts w:ascii="Times New Roman" w:hAnsi="Times New Roman" w:cs="Times New Roman"/>
+          <w:lang w:val="en-US"/>
+        </w:rPr>
+        <w:t xml:space="preserve">linear </w:t>
+      </w:r>
+      <w:r>
+        <w:rPr>
+          <w:rFonts w:ascii="Times New Roman" w:hAnsi="Times New Roman" w:cs="Times New Roman"/>
+          <w:lang w:val="en-US"/>
+        </w:rPr>
+        <w:t>VCAs</w:t>
+      </w:r>
+      <w:r>
+        <w:rPr>
+          <w:rFonts w:ascii="Times New Roman" w:hAnsi="Times New Roman" w:cs="Times New Roman"/>
+          <w:lang w:val="en-US"/>
+        </w:rPr>
+        <w:t xml:space="preserve"> based on LM13700 dual OTA ICs. Each channel can be individually routed out through channel </w:t>
+      </w:r>
+      <w:proofErr w:type="gramStart"/>
+      <w:r>
+        <w:rPr>
+          <w:rFonts w:ascii="Times New Roman" w:hAnsi="Times New Roman" w:cs="Times New Roman"/>
+          <w:lang w:val="en-US"/>
+        </w:rPr>
+        <w:t>outputs, but</w:t>
+      </w:r>
+      <w:proofErr w:type="gramEnd"/>
+      <w:r>
+        <w:rPr>
+          <w:rFonts w:ascii="Times New Roman" w:hAnsi="Times New Roman" w:cs="Times New Roman"/>
+          <w:lang w:val="en-US"/>
+        </w:rPr>
+        <w:t xml:space="preserve"> are normalled to be mixed and output at the fourth output. This means that </w:t>
+      </w:r>
     </w:p>
     <w:p>
       <w:pPr>
@@ -178,21 +263,19 @@
         </w:rPr>
         <w:t xml:space="preserve">This module requires </w:t>
       </w:r>
-      <w:proofErr w:type="spellStart"/>
-      <w:r>
-        <w:rPr>
-          <w:rFonts w:ascii="Times New Roman" w:hAnsi="Times New Roman" w:cs="Times New Roman"/>
-          <w:lang w:val="en-US"/>
-        </w:rPr>
-        <w:t>XXXhp</w:t>
-      </w:r>
-      <w:proofErr w:type="spellEnd"/>
-      <w:r>
-        <w:rPr>
-          <w:rFonts w:ascii="Times New Roman" w:hAnsi="Times New Roman" w:cs="Times New Roman"/>
-          <w:lang w:val="en-US"/>
-        </w:rPr>
-        <w:t xml:space="preserve"> of free space in a rack. When installing, </w:t>
+      <w:r>
+        <w:rPr>
+          <w:rFonts w:ascii="Times New Roman" w:hAnsi="Times New Roman" w:cs="Times New Roman"/>
+          <w:lang w:val="en-US"/>
+        </w:rPr>
+        <w:t>10</w:t>
+      </w:r>
+      <w:r>
+        <w:rPr>
+          <w:rFonts w:ascii="Times New Roman" w:hAnsi="Times New Roman" w:cs="Times New Roman"/>
+          <w:lang w:val="en-US"/>
+        </w:rPr>
+        <w:t xml:space="preserve">hp of free space in a rack. When installing, </w:t>
       </w:r>
       <w:r>
         <w:rPr>
@@ -361,36 +444,138 @@
           <w:bCs/>
           <w:lang w:val="en-US"/>
         </w:rPr>
-        <w:t>is/is not</w:t>
-      </w:r>
-      <w:r>
-        <w:rPr>
-          <w:rFonts w:ascii="Times New Roman" w:hAnsi="Times New Roman" w:cs="Times New Roman"/>
-          <w:lang w:val="en-US"/>
-        </w:rPr>
-        <w:t xml:space="preserve"> reverse polarity protected. This means that the module will not/will get</w:t>
-      </w:r>
-      <w:r>
-        <w:rPr>
-          <w:rFonts w:ascii="Times New Roman" w:hAnsi="Times New Roman" w:cs="Times New Roman"/>
-          <w:lang w:val="en-US"/>
-        </w:rPr>
-        <w:t xml:space="preserve"> </w:t>
-      </w:r>
-      <w:r>
-        <w:rPr>
-          <w:rFonts w:ascii="Times New Roman" w:hAnsi="Times New Roman" w:cs="Times New Roman"/>
-          <w:lang w:val="en-US"/>
-        </w:rPr>
-        <w:t>heavily</w:t>
-      </w:r>
-      <w:r>
-        <w:rPr>
-          <w:rFonts w:ascii="Times New Roman" w:hAnsi="Times New Roman" w:cs="Times New Roman"/>
-          <w:lang w:val="en-US"/>
-        </w:rPr>
-        <w:t xml:space="preserve"> damaged if the power cable is plugged in backwards. However, a reversed power cable may still cause damage to the components in the module, as well as other modules connected to the same power supply. </w:t>
-      </w:r>
+        <w:t>is not</w:t>
+      </w:r>
+      <w:r>
+        <w:rPr>
+          <w:rFonts w:ascii="Times New Roman" w:hAnsi="Times New Roman" w:cs="Times New Roman"/>
+          <w:lang w:val="en-US"/>
+        </w:rPr>
+        <w:t xml:space="preserve"> reverse polarity protected. This means that the module will get</w:t>
+      </w:r>
+      <w:r>
+        <w:rPr>
+          <w:rFonts w:ascii="Times New Roman" w:hAnsi="Times New Roman" w:cs="Times New Roman"/>
+          <w:lang w:val="en-US"/>
+        </w:rPr>
+        <w:t xml:space="preserve"> heavily</w:t>
+      </w:r>
+      <w:r>
+        <w:rPr>
+          <w:rFonts w:ascii="Times New Roman" w:hAnsi="Times New Roman" w:cs="Times New Roman"/>
+          <w:lang w:val="en-US"/>
+        </w:rPr>
+        <w:t xml:space="preserve"> damaged if the power cable is plugged in backwards. </w:t>
+      </w:r>
+      <w:r>
+        <w:rPr>
+          <w:rFonts w:ascii="Times New Roman" w:hAnsi="Times New Roman" w:cs="Times New Roman"/>
+          <w:lang w:val="en-US"/>
+        </w:rPr>
+        <w:t>Additionally</w:t>
+      </w:r>
+      <w:r>
+        <w:rPr>
+          <w:rFonts w:ascii="Times New Roman" w:hAnsi="Times New Roman" w:cs="Times New Roman"/>
+          <w:lang w:val="en-US"/>
+        </w:rPr>
+        <w:t xml:space="preserve">, a reversed power cable may still cause </w:t>
+      </w:r>
+      <w:r>
+        <w:rPr>
+          <w:rFonts w:ascii="Times New Roman" w:hAnsi="Times New Roman" w:cs="Times New Roman"/>
+          <w:lang w:val="en-US"/>
+        </w:rPr>
+        <w:t>damage to</w:t>
+      </w:r>
+      <w:r>
+        <w:rPr>
+          <w:rFonts w:ascii="Times New Roman" w:hAnsi="Times New Roman" w:cs="Times New Roman"/>
+          <w:lang w:val="en-US"/>
+        </w:rPr>
+        <w:t xml:space="preserve"> other modules connected to the same power supply. </w:t>
+      </w:r>
+    </w:p>
+    <w:p>
+      <w:pPr>
+        <w:spacing w:line="360" w:lineRule="auto"/>
+        <w:rPr>
+          <w:rFonts w:ascii="Times New Roman" w:hAnsi="Times New Roman" w:cs="Times New Roman"/>
+          <w:lang w:val="en-US"/>
+        </w:rPr>
+      </w:pPr>
+    </w:p>
+    <w:p>
+      <w:pPr>
+        <w:spacing w:line="360" w:lineRule="auto"/>
+        <w:rPr>
+          <w:rFonts w:ascii="Times New Roman" w:hAnsi="Times New Roman" w:cs="Times New Roman"/>
+          <w:lang w:val="en-US"/>
+        </w:rPr>
+      </w:pPr>
+    </w:p>
+    <w:p>
+      <w:pPr>
+        <w:spacing w:line="360" w:lineRule="auto"/>
+        <w:rPr>
+          <w:rFonts w:ascii="Times New Roman" w:hAnsi="Times New Roman" w:cs="Times New Roman"/>
+          <w:lang w:val="en-US"/>
+        </w:rPr>
+      </w:pPr>
+    </w:p>
+    <w:p>
+      <w:pPr>
+        <w:spacing w:line="360" w:lineRule="auto"/>
+        <w:rPr>
+          <w:rFonts w:ascii="Times New Roman" w:hAnsi="Times New Roman" w:cs="Times New Roman"/>
+          <w:lang w:val="en-US"/>
+        </w:rPr>
+      </w:pPr>
+    </w:p>
+    <w:p>
+      <w:pPr>
+        <w:spacing w:line="360" w:lineRule="auto"/>
+        <w:rPr>
+          <w:rFonts w:ascii="Times New Roman" w:hAnsi="Times New Roman" w:cs="Times New Roman"/>
+          <w:lang w:val="en-US"/>
+        </w:rPr>
+      </w:pPr>
+    </w:p>
+    <w:p>
+      <w:pPr>
+        <w:spacing w:line="360" w:lineRule="auto"/>
+        <w:rPr>
+          <w:rFonts w:ascii="Times New Roman" w:hAnsi="Times New Roman" w:cs="Times New Roman"/>
+          <w:lang w:val="en-US"/>
+        </w:rPr>
+      </w:pPr>
+    </w:p>
+    <w:p>
+      <w:pPr>
+        <w:spacing w:line="360" w:lineRule="auto"/>
+        <w:rPr>
+          <w:rFonts w:ascii="Times New Roman" w:hAnsi="Times New Roman" w:cs="Times New Roman"/>
+          <w:lang w:val="en-US"/>
+        </w:rPr>
+      </w:pPr>
+    </w:p>
+    <w:p>
+      <w:pPr>
+        <w:spacing w:line="360" w:lineRule="auto"/>
+        <w:rPr>
+          <w:rFonts w:ascii="Times New Roman" w:hAnsi="Times New Roman" w:cs="Times New Roman"/>
+          <w:lang w:val="en-US"/>
+        </w:rPr>
+      </w:pPr>
+    </w:p>
+    <w:p>
+      <w:pPr>
+        <w:spacing w:line="360" w:lineRule="auto"/>
+        <w:rPr>
+          <w:rFonts w:ascii="Times New Roman" w:hAnsi="Times New Roman" w:cs="Times New Roman"/>
+          <w:lang w:val="en-US"/>
+        </w:rPr>
+      </w:pPr>
     </w:p>
     <w:p>
       <w:pPr>
@@ -420,6 +605,7 @@
           <w:u w:val="single"/>
           <w:lang w:val="en-US"/>
         </w:rPr>
+        <w:lastRenderedPageBreak/>
         <w:t>3 Front Panel Overview</w:t>
       </w:r>
     </w:p>
@@ -434,6 +620,90 @@
           <w:lang w:val="en-US"/>
         </w:rPr>
       </w:pPr>
+      <w:r>
+        <w:rPr>
+          <w:rFonts w:ascii="Times New Roman" w:hAnsi="Times New Roman" w:cs="Times New Roman"/>
+          <w:b/>
+          <w:bCs/>
+          <w:noProof/>
+          <w:lang w:val="en-US"/>
+        </w:rPr>
+        <w:drawing>
+          <wp:anchor distT="0" distB="0" distL="114300" distR="114300" simplePos="0" relativeHeight="251658240" behindDoc="0" locked="0" layoutInCell="1" allowOverlap="1" wp14:anchorId="78C2B88A" wp14:editId="3A2FB922">
+            <wp:simplePos x="914400" y="1277007"/>
+            <wp:positionH relativeFrom="column">
+              <wp:align>left</wp:align>
+            </wp:positionH>
+            <wp:positionV relativeFrom="paragraph">
+              <wp:align>top</wp:align>
+            </wp:positionV>
+            <wp:extent cx="1432560" cy="3536315"/>
+            <wp:effectExtent l="0" t="0" r="2540" b="0"/>
+            <wp:wrapSquare wrapText="bothSides"/>
+            <wp:docPr id="2039099700" name="Picture 1" descr="A black and white audio mixer&#10;&#10;AI-generated content may be incorrect."/>
+            <wp:cNvGraphicFramePr>
+              <a:graphicFrameLocks xmlns:a="http://schemas.openxmlformats.org/drawingml/2006/main" noChangeAspect="1"/>
+            </wp:cNvGraphicFramePr>
+            <a:graphic xmlns:a="http://schemas.openxmlformats.org/drawingml/2006/main">
+              <a:graphicData uri="http://schemas.openxmlformats.org/drawingml/2006/picture">
+                <pic:pic xmlns:pic="http://schemas.openxmlformats.org/drawingml/2006/picture">
+                  <pic:nvPicPr>
+                    <pic:cNvPr id="2039099700" name="Picture 1" descr="A black and white audio mixer&#10;&#10;AI-generated content may be incorrect."/>
+                    <pic:cNvPicPr/>
+                  </pic:nvPicPr>
+                  <pic:blipFill rotWithShape="1">
+                    <a:blip r:embed="rId7" cstate="print">
+                      <a:extLst>
+                        <a:ext uri="{28A0092B-C50C-407E-A947-70E740481C1C}">
+                          <a14:useLocalDpi xmlns:a14="http://schemas.microsoft.com/office/drawing/2010/main" val="0"/>
+                        </a:ext>
+                      </a:extLst>
+                    </a:blip>
+                    <a:srcRect t="1206" b="-42"/>
+                    <a:stretch>
+                      <a:fillRect/>
+                    </a:stretch>
+                  </pic:blipFill>
+                  <pic:spPr bwMode="auto">
+                    <a:xfrm>
+                      <a:off x="0" y="0"/>
+                      <a:ext cx="1432560" cy="3536315"/>
+                    </a:xfrm>
+                    <a:prstGeom prst="rect">
+                      <a:avLst/>
+                    </a:prstGeom>
+                    <a:ln>
+                      <a:noFill/>
+                    </a:ln>
+                    <a:extLst>
+                      <a:ext uri="{53640926-AAD7-44D8-BBD7-CCE9431645EC}">
+                        <a14:shadowObscured xmlns:a14="http://schemas.microsoft.com/office/drawing/2010/main"/>
+                      </a:ext>
+                    </a:extLst>
+                  </pic:spPr>
+                </pic:pic>
+              </a:graphicData>
+            </a:graphic>
+          </wp:anchor>
+        </w:drawing>
+      </w:r>
+      <w:r>
+        <w:rPr>
+          <w:rFonts w:ascii="Times New Roman" w:hAnsi="Times New Roman" w:cs="Times New Roman"/>
+          <w:lang w:val="en-US"/>
+        </w:rPr>
+        <w:t xml:space="preserve">The 304 </w:t>
+      </w:r>
+      <w:r>
+        <w:rPr>
+          <w:rFonts w:ascii="Times New Roman" w:hAnsi="Times New Roman" w:cs="Times New Roman"/>
+          <w:b/>
+          <w:bCs/>
+          <w:u w:val="single"/>
+          <w:lang w:val="en-US"/>
+        </w:rPr>
+        <w:br w:type="textWrapping" w:clear="all"/>
+      </w:r>
     </w:p>
     <w:p>
       <w:pPr>
@@ -800,6 +1070,17 @@
                 <w:lang w:val="en-US"/>
               </w:rPr>
             </w:pPr>
+            <w:r>
+              <w:rPr>
+                <w:rFonts w:ascii="Times New Roman" w:hAnsi="Times New Roman" w:cs="Times New Roman"/>
+                <w:b w:val="0"/>
+                <w:bCs w:val="0"/>
+                <w:i/>
+                <w:iCs/>
+                <w:lang w:val="en-US"/>
+              </w:rPr>
+              <w:t>10hp</w:t>
+            </w:r>
           </w:p>
         </w:tc>
         <w:tc>
@@ -821,6 +1102,15 @@
                 <w:lang w:val="en-US"/>
               </w:rPr>
             </w:pPr>
+            <w:r>
+              <w:rPr>
+                <w:rFonts w:ascii="Times New Roman" w:hAnsi="Times New Roman" w:cs="Times New Roman"/>
+                <w:i/>
+                <w:iCs/>
+                <w:lang w:val="en-US"/>
+              </w:rPr>
+              <w:t>~35mm max.</w:t>
+            </w:r>
           </w:p>
         </w:tc>
         <w:tc>
@@ -1222,8 +1512,8 @@
       </w:r>
     </w:p>
     <w:sectPr>
-      <w:footerReference w:type="even" r:id="rId7"/>
-      <w:footerReference w:type="default" r:id="rId8"/>
+      <w:footerReference w:type="even" r:id="rId8"/>
+      <w:footerReference w:type="default" r:id="rId9"/>
       <w:pgSz w:w="12240" w:h="15840"/>
       <w:pgMar w:top="1440" w:right="1440" w:bottom="1440" w:left="1440" w:header="708" w:footer="708" w:gutter="0"/>
       <w:cols w:space="708"/>

</xml_diff>